<commit_message>
Investigating Windows was finished
</commit_message>
<xml_diff>
--- a/THM_challenges/Easy/Investigating Windows/Investigating Windows.docx
+++ b/THM_challenges/Easy/Investigating Windows/Investigating Windows.docx
@@ -59,6 +59,9 @@
     </w:p>
     <w:p>
       <w:r>
+        <w:rPr>
+          <w:noProof/>
+        </w:rPr>
         <w:drawing>
           <wp:inline distT="0" distB="0" distL="0" distR="0" wp14:anchorId="00420FA0" wp14:editId="46E2A972">
             <wp:extent cx="6375400" cy="3751307"/>
@@ -101,15 +104,7 @@
         <w:t>Then, I</w:t>
       </w:r>
       <w:r>
-        <w:t xml:space="preserve"> opened the CMD and wrote the “</w:t>
-      </w:r>
-      <w:proofErr w:type="spellStart"/>
-      <w:r>
-        <w:t>systeminfo</w:t>
-      </w:r>
-      <w:proofErr w:type="spellEnd"/>
-      <w:r>
-        <w:t xml:space="preserve">” command to find information about this </w:t>
+        <w:t xml:space="preserve"> opened the CMD and wrote the “systeminfo” command to find information about this </w:t>
       </w:r>
       <w:r>
         <w:t>W</w:t>
@@ -120,6 +115,9 @@
     </w:p>
     <w:p>
       <w:r>
+        <w:rPr>
+          <w:noProof/>
+        </w:rPr>
         <w:drawing>
           <wp:inline distT="0" distB="0" distL="0" distR="0" wp14:anchorId="37D6FCD1" wp14:editId="4DADA1E3">
             <wp:extent cx="3798899" cy="864945"/>
@@ -178,6 +176,9 @@
     </w:p>
     <w:p>
       <w:r>
+        <w:rPr>
+          <w:noProof/>
+        </w:rPr>
         <w:drawing>
           <wp:inline distT="0" distB="0" distL="0" distR="0" wp14:anchorId="035DAAA3" wp14:editId="3B67E863">
             <wp:extent cx="4610500" cy="438188"/>
@@ -236,6 +237,9 @@
     </w:p>
     <w:p>
       <w:r>
+        <w:rPr>
+          <w:noProof/>
+        </w:rPr>
         <w:lastRenderedPageBreak/>
         <w:drawing>
           <wp:inline distT="0" distB="0" distL="0" distR="0" wp14:anchorId="26DA0E9A" wp14:editId="166EE6B7">
@@ -304,13 +308,7 @@
         <w:t xml:space="preserve">connect to a specific </w:t>
       </w:r>
       <w:r>
-        <w:t>host, they perform a process called “</w:t>
-      </w:r>
-      <w:r>
-        <w:t>DNS lookup</w:t>
-      </w:r>
-      <w:r>
-        <w:t xml:space="preserve">”. This process, in short, search </w:t>
+        <w:t xml:space="preserve">host, they perform a process called “DNS lookup”. This process, in short, search </w:t>
       </w:r>
       <w:r>
         <w:t xml:space="preserve">for </w:t>
@@ -368,6 +366,9 @@
     </w:p>
     <w:p>
       <w:r>
+        <w:rPr>
+          <w:noProof/>
+        </w:rPr>
         <w:lastRenderedPageBreak/>
         <w:drawing>
           <wp:inline distT="0" distB="0" distL="0" distR="0" wp14:anchorId="6A459FD8" wp14:editId="0C11FF22">
@@ -477,6 +478,9 @@
     </w:p>
     <w:p>
       <w:r>
+        <w:rPr>
+          <w:noProof/>
+        </w:rPr>
         <w:drawing>
           <wp:inline distT="0" distB="0" distL="0" distR="0" wp14:anchorId="4F030E8D" wp14:editId="4352170E">
             <wp:extent cx="3798899" cy="209568"/>
@@ -531,15 +535,7 @@
         <w:t xml:space="preserve">At this point, I </w:t>
       </w:r>
       <w:r>
-        <w:t xml:space="preserve">needed to check for the 2 users (other </w:t>
-      </w:r>
-      <w:proofErr w:type="spellStart"/>
-      <w:r>
-        <w:t>that</w:t>
-      </w:r>
-      <w:proofErr w:type="spellEnd"/>
-      <w:r>
-        <w:t xml:space="preserve"> “Administrator”) </w:t>
+        <w:t xml:space="preserve">needed to check for the 2 users (other that “Administrator”) </w:t>
       </w:r>
       <w:r>
         <w:t>who</w:t>
@@ -559,6 +555,9 @@
     </w:p>
     <w:p>
       <w:r>
+        <w:rPr>
+          <w:noProof/>
+        </w:rPr>
         <w:lastRenderedPageBreak/>
         <w:drawing>
           <wp:inline distT="0" distB="0" distL="0" distR="0" wp14:anchorId="7CEE54AE" wp14:editId="5E338AE6">
@@ -599,6 +598,9 @@
     </w:p>
     <w:p>
       <w:r>
+        <w:rPr>
+          <w:noProof/>
+        </w:rPr>
         <w:drawing>
           <wp:inline distT="0" distB="0" distL="0" distR="0" wp14:anchorId="27775D7E" wp14:editId="28DA2336">
             <wp:extent cx="3238781" cy="2305250"/>
@@ -681,6 +683,9 @@
         <w:t xml:space="preserve"> </w:t>
       </w:r>
       <w:r>
+        <w:rPr>
+          <w:noProof/>
+        </w:rPr>
         <w:drawing>
           <wp:inline distT="0" distB="0" distL="0" distR="0" wp14:anchorId="322766F1" wp14:editId="2CA4FD99">
             <wp:extent cx="5132515" cy="895428"/>
@@ -728,6 +733,9 @@
     </w:p>
     <w:p>
       <w:r>
+        <w:rPr>
+          <w:noProof/>
+        </w:rPr>
         <w:drawing>
           <wp:inline distT="0" distB="0" distL="0" distR="0" wp14:anchorId="7BE826BB" wp14:editId="1422D15E">
             <wp:extent cx="7437765" cy="1665114"/>
@@ -797,11 +805,20 @@
         <w:t>compromise take place</w:t>
       </w:r>
       <w:r>
-        <w:t>. I entered to C:\\ and saw this:</w:t>
-      </w:r>
-    </w:p>
-    <w:p>
-      <w:r>
+        <w:t xml:space="preserve">. I </w:t>
+      </w:r>
+      <w:r>
+        <w:t>entered</w:t>
+      </w:r>
+      <w:r>
+        <w:t xml:space="preserve"> C:\\ and saw this:</w:t>
+      </w:r>
+    </w:p>
+    <w:p>
+      <w:r>
+        <w:rPr>
+          <w:noProof/>
+        </w:rPr>
         <w:drawing>
           <wp:inline distT="0" distB="0" distL="0" distR="0" wp14:anchorId="1796A5FB" wp14:editId="096A4483">
             <wp:extent cx="4572396" cy="1905165"/>
@@ -861,17 +878,301 @@
     </w:p>
     <w:p>
       <w:r>
-        <w:t xml:space="preserve">Then I entered the Event Viewer to see </w:t>
-      </w:r>
-      <w:r>
-        <w:t>at what time did Windows first assign special privileges to a new logon</w:t>
+        <w:t>Then</w:t>
+      </w:r>
+      <w:r>
+        <w:t>,</w:t>
+      </w:r>
+      <w:r>
+        <w:t xml:space="preserve"> I entered the Event Viewer </w:t>
+      </w:r>
+      <w:r>
+        <w:t xml:space="preserve">at the privacy section </w:t>
+      </w:r>
+      <w:r>
+        <w:t>and found that</w:t>
+      </w:r>
+      <w:r>
+        <w:t xml:space="preserve"> it was </w:t>
+      </w:r>
+      <w:r>
+        <w:t xml:space="preserve">Windows first </w:t>
+      </w:r>
+      <w:r>
+        <w:t>assign</w:t>
+      </w:r>
+      <w:r>
+        <w:t xml:space="preserve"> special privileges to a new logon</w:t>
+      </w:r>
+      <w:r>
+        <w:t xml:space="preserve"> was on “</w:t>
+      </w:r>
+      <w:r>
+        <w:t>3/2/2019 4:04:49 PM</w:t>
+      </w:r>
+      <w:r>
+        <w:t>”</w:t>
+      </w:r>
+      <w:r>
+        <w:t>.</w:t>
+      </w:r>
+    </w:p>
+    <w:p>
+      <w:r>
+        <w:t xml:space="preserve">Thereafter, I </w:t>
+      </w:r>
+      <w:r>
+        <w:t>navigated to the “C:\TMP” folder</w:t>
+      </w:r>
+      <w:r>
+        <w:t xml:space="preserve"> </w:t>
+      </w:r>
+      <w:r>
+        <w:t xml:space="preserve">and found there a </w:t>
+      </w:r>
+      <w:r>
+        <w:t xml:space="preserve">tool </w:t>
+      </w:r>
+      <w:r>
+        <w:t>called “</w:t>
+      </w:r>
+      <w:r>
+        <w:t>Mimikatz</w:t>
+      </w:r>
+      <w:r>
+        <w:t>”</w:t>
       </w:r>
       <w:r>
         <w:t>:</w:t>
       </w:r>
     </w:p>
-    <w:p/>
-    <w:p/>
+    <w:p>
+      <w:r>
+        <w:drawing>
+          <wp:inline distT="0" distB="0" distL="0" distR="0" wp14:anchorId="5A67B690" wp14:editId="0AECD600">
+            <wp:extent cx="7556500" cy="4037965"/>
+            <wp:effectExtent l="0" t="0" r="6350" b="635"/>
+            <wp:docPr id="779337079" name="תמונה 1"/>
+            <wp:cNvGraphicFramePr>
+              <a:graphicFrameLocks xmlns:a="http://schemas.openxmlformats.org/drawingml/2006/main" noChangeAspect="1"/>
+            </wp:cNvGraphicFramePr>
+            <a:graphic xmlns:a="http://schemas.openxmlformats.org/drawingml/2006/main">
+              <a:graphicData uri="http://schemas.openxmlformats.org/drawingml/2006/picture">
+                <pic:pic xmlns:pic="http://schemas.openxmlformats.org/drawingml/2006/picture">
+                  <pic:nvPicPr>
+                    <pic:cNvPr id="779337079" name=""/>
+                    <pic:cNvPicPr/>
+                  </pic:nvPicPr>
+                  <pic:blipFill>
+                    <a:blip r:embed="rId15"/>
+                    <a:stretch>
+                      <a:fillRect/>
+                    </a:stretch>
+                  </pic:blipFill>
+                  <pic:spPr>
+                    <a:xfrm>
+                      <a:off x="0" y="0"/>
+                      <a:ext cx="7556500" cy="4037965"/>
+                    </a:xfrm>
+                    <a:prstGeom prst="rect">
+                      <a:avLst/>
+                    </a:prstGeom>
+                  </pic:spPr>
+                </pic:pic>
+              </a:graphicData>
+            </a:graphic>
+          </wp:inline>
+        </w:drawing>
+      </w:r>
+    </w:p>
+    <w:p>
+      <w:r>
+        <w:t>Afterwards, I found the</w:t>
+      </w:r>
+      <w:r>
+        <w:t xml:space="preserve"> IP</w:t>
+      </w:r>
+      <w:r>
+        <w:t xml:space="preserve"> attackes’ serves</w:t>
+      </w:r>
+      <w:r>
+        <w:t xml:space="preserve"> in the hosts file:</w:t>
+      </w:r>
+    </w:p>
+    <w:p>
+      <w:r>
+        <w:lastRenderedPageBreak/>
+        <w:drawing>
+          <wp:inline distT="0" distB="0" distL="0" distR="0" wp14:anchorId="4D1857D9" wp14:editId="39EF05BC">
+            <wp:extent cx="5109653" cy="4934378"/>
+            <wp:effectExtent l="0" t="0" r="0" b="0"/>
+            <wp:docPr id="1374480348" name="תמונה 1"/>
+            <wp:cNvGraphicFramePr>
+              <a:graphicFrameLocks xmlns:a="http://schemas.openxmlformats.org/drawingml/2006/main" noChangeAspect="1"/>
+            </wp:cNvGraphicFramePr>
+            <a:graphic xmlns:a="http://schemas.openxmlformats.org/drawingml/2006/main">
+              <a:graphicData uri="http://schemas.openxmlformats.org/drawingml/2006/picture">
+                <pic:pic xmlns:pic="http://schemas.openxmlformats.org/drawingml/2006/picture">
+                  <pic:nvPicPr>
+                    <pic:cNvPr id="1374480348" name=""/>
+                    <pic:cNvPicPr/>
+                  </pic:nvPicPr>
+                  <pic:blipFill>
+                    <a:blip r:embed="rId16"/>
+                    <a:stretch>
+                      <a:fillRect/>
+                    </a:stretch>
+                  </pic:blipFill>
+                  <pic:spPr>
+                    <a:xfrm>
+                      <a:off x="0" y="0"/>
+                      <a:ext cx="5109653" cy="4934378"/>
+                    </a:xfrm>
+                    <a:prstGeom prst="rect">
+                      <a:avLst/>
+                    </a:prstGeom>
+                  </pic:spPr>
+                </pic:pic>
+              </a:graphicData>
+            </a:graphic>
+          </wp:inline>
+        </w:drawing>
+      </w:r>
+    </w:p>
+    <w:p>
+      <w:r>
+        <w:t>it was “</w:t>
+      </w:r>
+      <w:r>
+        <w:t>76.32.97.132”.</w:t>
+      </w:r>
+    </w:p>
+    <w:p>
+      <w:r>
+        <w:t xml:space="preserve">Later, I </w:t>
+      </w:r>
+      <w:r>
+        <w:t>found on “</w:t>
+      </w:r>
+      <w:r>
+        <w:t>C:\inetpub\wwwroot</w:t>
+      </w:r>
+      <w:r>
+        <w:t>” a file named “test.jsp” that contains a code which behave like a shell:</w:t>
+      </w:r>
+    </w:p>
+    <w:p>
+      <w:r>
+        <w:drawing>
+          <wp:inline distT="0" distB="0" distL="0" distR="0" wp14:anchorId="49CE3BAB" wp14:editId="07D3E8E4">
+            <wp:extent cx="5601185" cy="3829382"/>
+            <wp:effectExtent l="0" t="0" r="0" b="0"/>
+            <wp:docPr id="1424927244" name="תמונה 1"/>
+            <wp:cNvGraphicFramePr>
+              <a:graphicFrameLocks xmlns:a="http://schemas.openxmlformats.org/drawingml/2006/main" noChangeAspect="1"/>
+            </wp:cNvGraphicFramePr>
+            <a:graphic xmlns:a="http://schemas.openxmlformats.org/drawingml/2006/main">
+              <a:graphicData uri="http://schemas.openxmlformats.org/drawingml/2006/picture">
+                <pic:pic xmlns:pic="http://schemas.openxmlformats.org/drawingml/2006/picture">
+                  <pic:nvPicPr>
+                    <pic:cNvPr id="1424927244" name=""/>
+                    <pic:cNvPicPr/>
+                  </pic:nvPicPr>
+                  <pic:blipFill>
+                    <a:blip r:embed="rId17"/>
+                    <a:stretch>
+                      <a:fillRect/>
+                    </a:stretch>
+                  </pic:blipFill>
+                  <pic:spPr>
+                    <a:xfrm>
+                      <a:off x="0" y="0"/>
+                      <a:ext cx="5601185" cy="3829382"/>
+                    </a:xfrm>
+                    <a:prstGeom prst="rect">
+                      <a:avLst/>
+                    </a:prstGeom>
+                  </pic:spPr>
+                </pic:pic>
+              </a:graphicData>
+            </a:graphic>
+          </wp:inline>
+        </w:drawing>
+      </w:r>
+    </w:p>
+    <w:p>
+      <w:r>
+        <w:lastRenderedPageBreak/>
+        <w:t xml:space="preserve">After that, I found this firewall </w:t>
+      </w:r>
+      <w:r>
+        <w:t xml:space="preserve">rule in the windows firewall inbound </w:t>
+      </w:r>
+      <w:r>
+        <w:t>rules:</w:t>
+      </w:r>
+    </w:p>
+    <w:p>
+      <w:r>
+        <w:drawing>
+          <wp:inline distT="0" distB="0" distL="0" distR="0" wp14:anchorId="3AE9DB11" wp14:editId="3885FF22">
+            <wp:extent cx="1836579" cy="171465"/>
+            <wp:effectExtent l="0" t="0" r="0" b="0"/>
+            <wp:docPr id="1066360531" name="תמונה 1"/>
+            <wp:cNvGraphicFramePr>
+              <a:graphicFrameLocks xmlns:a="http://schemas.openxmlformats.org/drawingml/2006/main" noChangeAspect="1"/>
+            </wp:cNvGraphicFramePr>
+            <a:graphic xmlns:a="http://schemas.openxmlformats.org/drawingml/2006/main">
+              <a:graphicData uri="http://schemas.openxmlformats.org/drawingml/2006/picture">
+                <pic:pic xmlns:pic="http://schemas.openxmlformats.org/drawingml/2006/picture">
+                  <pic:nvPicPr>
+                    <pic:cNvPr id="1066360531" name=""/>
+                    <pic:cNvPicPr/>
+                  </pic:nvPicPr>
+                  <pic:blipFill>
+                    <a:blip r:embed="rId18"/>
+                    <a:stretch>
+                      <a:fillRect/>
+                    </a:stretch>
+                  </pic:blipFill>
+                  <pic:spPr>
+                    <a:xfrm>
+                      <a:off x="0" y="0"/>
+                      <a:ext cx="1836579" cy="171465"/>
+                    </a:xfrm>
+                    <a:prstGeom prst="rect">
+                      <a:avLst/>
+                    </a:prstGeom>
+                  </pic:spPr>
+                </pic:pic>
+              </a:graphicData>
+            </a:graphic>
+          </wp:inline>
+        </w:drawing>
+      </w:r>
+    </w:p>
+    <w:p>
+      <w:r>
+        <w:t>This rule</w:t>
+      </w:r>
+      <w:r>
+        <w:t xml:space="preserve"> was opened on port 1337 which is the port that was last used by the attackers!</w:t>
+      </w:r>
+    </w:p>
+    <w:p>
+      <w:r>
+        <w:t xml:space="preserve">At the end, I found </w:t>
+      </w:r>
+      <w:r>
+        <w:t xml:space="preserve">on the hosts file that the website that </w:t>
+      </w:r>
+      <w:r>
+        <w:t>“google.com”</w:t>
+      </w:r>
+      <w:r>
+        <w:t>.</w:t>
+      </w:r>
+    </w:p>
     <w:sectPr>
       <w:pgSz w:w="12240" w:h="15840"/>
       <w:pgMar w:top="170" w:right="170" w:bottom="170" w:left="170" w:header="720" w:footer="720" w:gutter="0"/>

</xml_diff>